<commit_message>
fix: update fragment templates with corrected styles and content
Co-Authored-By: Claude Opus 4.5 <noreply@anthropic.com>
</commit_message>
<xml_diff>
--- a/templates/pleadings/fragments/cert_compliance.docx
+++ b/templates/pleadings/fragments/cert_compliance.docx
@@ -8,7 +8,6 @@
         <w:pageBreakBefore/>
       </w:pPr>
       <w:r>
-        <w:lastRenderedPageBreak/>
         <w:t>Certificate of Compliance</w:t>
       </w:r>
     </w:p>
@@ -22,21 +21,13 @@
         <w:pStyle w:val="normal0"/>
       </w:pPr>
       <w:r>
-        <w:t xml:space="preserve">The undersigned, counsel of record </w:t>
-      </w:r>
-      <w:proofErr w:type="gramStart"/>
-      <w:r>
-        <w:t>for</w:t>
+        <w:t>The undersigned, counsel of record for</w:t>
       </w:r>
       <w:r>
         <w:t xml:space="preserve"> </w:t>
       </w:r>
       <w:r>
-        <w:t>{{"</w:t>
-      </w:r>
-      <w:proofErr w:type="gramEnd"/>
-      <w:r>
-        <w:t xml:space="preserve">Plaintiffs" if </w:t>
+        <w:t xml:space="preserve">{{"Plaintiffs" if </w:t>
       </w:r>
       <w:proofErr w:type="spellStart"/>
       <w:r>
@@ -44,16 +35,11 @@
       </w:r>
       <w:proofErr w:type="spellEnd"/>
       <w:r>
-        <w:t xml:space="preserve"> else "</w:t>
-      </w:r>
-      <w:proofErr w:type="gramStart"/>
-      <w:r>
-        <w:t>Plaintiff"}}</w:t>
+        <w:t xml:space="preserve"> else "Plaintiff"}}</w:t>
       </w:r>
       <w:r>
         <w:t>,</w:t>
       </w:r>
-      <w:proofErr w:type="gramEnd"/>
       <w:r>
         <w:t xml:space="preserve"> </w:t>
       </w:r>
@@ -114,22 +100,15 @@
         <w:t xml:space="preserve"> </w:t>
       </w:r>
       <w:r>
-        <w:fldChar w:fldCharType="begin"/>
+        <w:t xml:space="preserve">{{ </w:t>
       </w:r>
+      <w:proofErr w:type="spellStart"/>
       <w:r>
-        <w:instrText xml:space="preserve"> DATE \@ "MMMM d, yyyy" </w:instrText>
+        <w:t>date_formatted</w:t>
       </w:r>
+      <w:proofErr w:type="spellEnd"/>
       <w:r>
-        <w:fldChar w:fldCharType="separate"/>
-      </w:r>
-      <w:r>
-        <w:rPr>
-          <w:noProof/>
-        </w:rPr>
-        <w:t>January 15, 2026</w:t>
-      </w:r>
-      <w:r>
-        <w:fldChar w:fldCharType="end"/>
+        <w:t xml:space="preserve"> }}</w:t>
       </w:r>
       <w:r>
         <w:tab/>
@@ -254,14 +233,7 @@
       </w:r>
       <w:r>
         <w:tab/>
-      </w:r>
-      <w:proofErr w:type="gramStart"/>
-      <w:r>
-        <w:t>By</w:t>
-      </w:r>
-      <w:proofErr w:type="gramEnd"/>
-      <w:r>
-        <w:t>:</w:t>
+        <w:t>By:</w:t>
       </w:r>
       <w:r>
         <w:tab/>
@@ -586,22 +558,6 @@
       <w:pPr>
         <w:spacing w:line="240" w:lineRule="auto"/>
       </w:pPr>
-    </w:p>
-  </w:footnote>
-  <w:footnote w:id="2">
-    <w:p>
-      <w:r>
-        <w:rPr>
-          <w:rStyle w:val="FootnoteReference"/>
-        </w:rPr>
-        <w:footnoteRef/>
-      </w:r>
-      <w:r>
-        <w:t xml:space="preserve"> </w:t>
-      </w:r>
-      <w:r>
-        <w:t>Pursuant to Local Rule 5-4.3.4, as the filer of this document, I attest that all other signatories listed, and on whose behalf the filing is submitted, concur in the filing’s content and have authorized the filing.</w:t>
-      </w:r>
     </w:p>
   </w:footnote>
 </w:footnotes>
@@ -7207,7 +7163,12 @@
 </file>
 
 <file path=customXml/item2.xml><?xml version="1.0" encoding="utf-8"?>
-<b:Sources xmlns:b="http://schemas.openxmlformats.org/officeDocument/2006/bibliography" xmlns="http://schemas.openxmlformats.org/officeDocument/2006/bibliography" SelectedStyle="\APASixthEditionOfficeOnline.xsl" StyleName="APA" Version="6"/>
+<caseData xmlns="urn:custom-schema">
+  <Plaintiffs>Dorothey Heimbach</Plaintiffs>
+  <AuthorName>Cooper Alison-Mayne</AuthorName>
+  <Email/>
+  <CaseNumber/>
+</caseData>
 </file>
 
 <file path=customXml/item3.xml><?xml version="1.0" encoding="utf-8"?>
@@ -7217,12 +7178,7 @@
 </file>
 
 <file path=customXml/item4.xml><?xml version="1.0" encoding="utf-8"?>
-<caseData xmlns="urn:custom-schema">
-  <Plaintiffs>Dorothey Heimbach</Plaintiffs>
-  <AuthorName>Cooper Alison-Mayne</AuthorName>
-  <Email/>
-  <CaseNumber/>
-</caseData>
+<b:Sources xmlns:b="http://schemas.openxmlformats.org/officeDocument/2006/bibliography" xmlns="http://schemas.openxmlformats.org/officeDocument/2006/bibliography" SelectedStyle="\APASixthEditionOfficeOnline.xsl" StyleName="APA" Version="6"/>
 </file>
 
 <file path=customXml/item5.xml><?xml version="1.0" encoding="utf-8"?>
@@ -7244,9 +7200,9 @@
 </file>
 
 <file path=customXml/itemProps2.xml><?xml version="1.0" encoding="utf-8"?>
-<ds:datastoreItem xmlns:ds="http://schemas.openxmlformats.org/officeDocument/2006/customXml" ds:itemID="{C036A6A0-214D-4DFD-B68C-05C096AFD24C}">
+<ds:datastoreItem xmlns:ds="http://schemas.openxmlformats.org/officeDocument/2006/customXml" ds:itemID="{A9C54615-EF12-4B3A-9614-573ABB2997F0}">
   <ds:schemaRefs>
-    <ds:schemaRef ds:uri="http://schemas.openxmlformats.org/officeDocument/2006/bibliography"/>
+    <ds:schemaRef ds:uri="urn:custom-schema"/>
   </ds:schemaRefs>
 </ds:datastoreItem>
 </file>
@@ -7260,9 +7216,9 @@
 </file>
 
 <file path=customXml/itemProps4.xml><?xml version="1.0" encoding="utf-8"?>
-<ds:datastoreItem xmlns:ds="http://schemas.openxmlformats.org/officeDocument/2006/customXml" ds:itemID="{A9C54615-EF12-4B3A-9614-573ABB2997F0}">
+<ds:datastoreItem xmlns:ds="http://schemas.openxmlformats.org/officeDocument/2006/customXml" ds:itemID="{C036A6A0-214D-4DFD-B68C-05C096AFD24C}">
   <ds:schemaRefs>
-    <ds:schemaRef ds:uri="urn:custom-schema"/>
+    <ds:schemaRef ds:uri="http://schemas.openxmlformats.org/officeDocument/2006/bibliography"/>
   </ds:schemaRefs>
 </ds:datastoreItem>
 </file>

</xml_diff>